<commit_message>
docs: FoamFit 기획서 v1.0 완성본
- 제품명 FoamFit 확정
- 순수 기계식 무전원 구조 반영
- 사용자 Lock 스위치 설계 추가
- B2B 설득 포인트 5가지 정리
- 3단계 로드맵 및 수익 구조 완성
- 7가지 다음 실행 과제 정의
- Markdown + Word 동시 업데이트

https://claude.ai/code/session_01LCBHvdPcgejHQR9Rum39Pr
</commit_message>
<xml_diff>
--- a/docs/superpowers/specs/2026-05-09-smart-toilet-paper-design.docx
+++ b/docs/superpowers/specs/2026-05-09-smart-toilet-paper-design.docx
@@ -10,9 +10,9 @@
         <w:rPr>
           <w:b/>
           <w:color w:val="1F497D"/>
-          <w:sz w:val="48"/>
+          <w:sz w:val="52"/>
         </w:rPr>
-        <w:t>스마트 화장지 솔루션 기획서</w:t>
+        <w:t>FoamFit 기획서</w:t>
       </w:r>
     </w:p>
     <w:p>
@@ -23,7 +23,18 @@
         <w:rPr>
           <w:i/>
         </w:rPr>
-        <w:t>상태: 설계 확정  |  최종 업데이트: 2026-05-09</w:t>
+        <w:t>물티슈가 필요 없는 스마트 화장지 솔루션</w:t>
+      </w:r>
+    </w:p>
+    <w:p>
+      <w:pPr>
+        <w:jc w:val="center"/>
+      </w:pPr>
+      <w:r>
+        <w:rPr>
+          <w:color w:val="6B7280"/>
+        </w:rPr>
+        <w:t>버전: 1.0 완성본  |  작성일: 2026-05-09</w:t>
       </w:r>
     </w:p>
     <w:p/>
@@ -35,21 +46,34 @@
       <w:r>
         <w:rPr>
           <w:color w:val="1F497D"/>
-          <w:sz w:val="36"/>
+          <w:sz w:val="32"/>
         </w:rPr>
         <w:t>1. 아이디어 개요</w:t>
       </w:r>
     </w:p>
     <w:p>
       <w:r>
-        <w:t>제품명 (가칭): 물티슈 없는 스마트 화장실 — 폼 분사 모듈</w:t>
+        <w:rPr>
+          <w:b/>
+        </w:rPr>
+        <w:t xml:space="preserve">제품명 (가칭): </w:t>
+      </w:r>
+      <w:r>
+        <w:t>FoamFit — 폼 분사 모듈</w:t>
       </w:r>
     </w:p>
     <w:p>
       <w:r>
-        <w:t>한 줄 정의: 공중화장실 점보롤 디스펜서에 부착하는 모듈형 장치로, 화장지를 뽑는 물리적 힘으로 기계식 펌프를 작동시켜 거품(폼) 세정제를 자동 분사함으로써 전기 없이도 물티슈 수준의 위생 경험을 제공한다.</w:t>
+        <w:rPr>
+          <w:b/>
+        </w:rPr>
+        <w:t xml:space="preserve">한 줄 정의: </w:t>
+      </w:r>
+      <w:r>
+        <w:t>공중화장실 점보롤 디스펜서에 부착하는 모듈형 장치로, 화장지를 뽑는 물리적 힘만으로 기계식 펌프를 작동시켜 거품(폼) 세정제를 자동 분사함으로써 전기 없이도 물티슈 수준의 위생 경험을 제공한다.</w:t>
       </w:r>
     </w:p>
+    <w:p/>
     <w:p>
       <w:pPr>
         <w:pStyle w:val="Heading1"/>
@@ -58,7 +82,7 @@
       <w:r>
         <w:rPr>
           <w:color w:val="1F497D"/>
-          <w:sz w:val="36"/>
+          <w:sz w:val="32"/>
         </w:rPr>
         <w:t>2. 문제 정의 (Pain Point)</w:t>
       </w:r>
@@ -73,7 +97,7 @@
         <w:pStyle w:val="ListBullet"/>
       </w:pPr>
       <w:r>
-        <w:t>물티슈는 변기 막힘 유발 (배관 문제)</w:t>
+        <w:t>변기 막힘: 물티슈는 물에 녹지 않아 배관을 막고 수십만 원의 처리 비용 유발</w:t>
       </w:r>
     </w:p>
     <w:p>
@@ -81,7 +105,7 @@
         <w:pStyle w:val="ListBullet"/>
       </w:pPr>
       <w:r>
-        <w:t>물티슈 쓰레기가 화장실 쓰레기통에 넘침</w:t>
+        <w:t>쓰레기 문제: 물티슈 쓰레기가 화장실 쓰레기통을 가득 채워 관리 부담 증가</w:t>
       </w:r>
     </w:p>
     <w:p>
@@ -89,14 +113,18 @@
         <w:pStyle w:val="ListBullet"/>
       </w:pPr>
       <w:r>
-        <w:t>비데는 설치 비용·공간 문제로 공중화장실 보급 어려움</w:t>
+        <w:t>비데 보급 불가: 설치 비용·공간·배관 문제로 공중화장실 보급 어려움</w:t>
       </w:r>
     </w:p>
     <w:p>
       <w:r>
+        <w:rPr>
+          <w:b/>
+        </w:rPr>
         <w:t>→ "깨끗하게 닦고 싶지만 물티슈는 쓰기 꺼려지는" 마찰(Friction) 지점</w:t>
       </w:r>
     </w:p>
+    <w:p/>
     <w:p>
       <w:pPr>
         <w:pStyle w:val="Heading1"/>
@@ -105,9 +133,9 @@
       <w:r>
         <w:rPr>
           <w:color w:val="1F497D"/>
-          <w:sz w:val="36"/>
+          <w:sz w:val="32"/>
         </w:rPr>
-        <w:t>3. 시장 검증 (블라인드 앱 설문, n=18)</w:t>
+        <w:t>3. 시장 검증 (블라인드 앱 설문, n=18, 2026)</w:t>
       </w:r>
     </w:p>
     <w:tbl>
@@ -280,6 +308,7 @@
         <w:t>응답자 절반이 더 쾌적한 대안이 있다면 기꺼이 사용할 의향 있음.</w:t>
       </w:r>
     </w:p>
+    <w:p/>
     <w:p>
       <w:pPr>
         <w:pStyle w:val="Heading1"/>
@@ -288,7 +317,7 @@
       <w:r>
         <w:rPr>
           <w:color w:val="1F497D"/>
-          <w:sz w:val="36"/>
+          <w:sz w:val="32"/>
         </w:rPr>
         <w:t>4. 솔루션 설계</w:t>
       </w:r>
@@ -301,7 +330,7 @@
       <w:r>
         <w:rPr>
           <w:color w:val="2E74B5"/>
-          <w:sz w:val="28"/>
+          <w:sz w:val="26"/>
         </w:rPr>
         <w:t>4-1. 하드웨어 구조</w:t>
       </w:r>
@@ -310,22 +339,24 @@
       <w:r>
         <w:rPr>
           <w:rFonts w:ascii="Courier New" w:hAnsi="Courier New"/>
+          <w:sz w:val="18"/>
         </w:rPr>
         <w:t>[ 점보롤 디스펜서 ]  ───  기존 그대로 유지</w:t>
         <w:br/>
         <w:t xml:space="preserve">        ↓</w:t>
         <w:br/>
-        <w:t>[ 부착형 모듈 ]</w:t>
+        <w:t>[ FoamFit 부착 모듈 ]</w:t>
         <w:br/>
-        <w:t xml:space="preserve">  ├─ 기계식 펌프: 휴지 인출 시 레버 연동 → 폼 미량 분사</w:t>
+        <w:t xml:space="preserve">  ├─ 기계식 펌프: 화장지 인출 시 레버 연동 → 폼 미량 분사</w:t>
         <w:br/>
         <w:t xml:space="preserve">  ├─ 폼 카트리지: 교체형 (OEM 폼 → 추후 자체 포뮬러)</w:t>
         <w:br/>
         <w:t xml:space="preserve">  ├─ 분사 노즐: 화장지 뽑히는 지점에 위치</w:t>
         <w:br/>
-        <w:t xml:space="preserve">  └─ 사용자 Lock 스위치: 원하지 않으면 직접 끔</w:t>
+        <w:t xml:space="preserve">  └─ 사용자 Lock 스위치: 원하지 않는 사용자는 직접 끌 수 있음</w:t>
       </w:r>
     </w:p>
+    <w:p/>
     <w:p>
       <w:r>
         <w:rPr>
@@ -334,13 +365,13 @@
         <w:t xml:space="preserve">핵심 원리: </w:t>
       </w:r>
       <w:r>
-        <w:t xml:space="preserve">휴지를 당기는 물리적 힘 → 기계식 펌프 압축 → 폼 분사. </w:t>
+        <w:t xml:space="preserve">화장지를 당기는 물리적 힘 → 기계식 펌프 압축 → 폼 분사. </w:t>
       </w:r>
       <w:r>
         <w:rPr>
           <w:b/>
         </w:rPr>
-        <w:t>전기·배터리 불필요.</w:t>
+        <w:t>전기·배터리 일절 불필요.</w:t>
       </w:r>
     </w:p>
     <w:p>
@@ -351,9 +382,9 @@
       <w:r>
         <w:rPr>
           <w:color w:val="2E74B5"/>
-          <w:sz w:val="28"/>
+          <w:sz w:val="26"/>
         </w:rPr>
-        <w:t>4-2. 주요 결정 사항</w:t>
+        <w:t>4-2. 주요 설계 결정</w:t>
       </w:r>
     </w:p>
     <w:tbl>
@@ -396,7 +427,7 @@
               <w:rPr>
                 <w:b/>
               </w:rPr>
-              <w:t>결정</w:t>
+              <w:t>결정 사항</w:t>
             </w:r>
           </w:p>
         </w:tc>
@@ -444,7 +475,7 @@
           </w:tcPr>
           <w:p>
             <w:r>
-              <w:t>화장지 찢어짐 방지, 세정력 향상</w:t>
+              <w:t>화장지 찢어짐 방지 + 세정력 향상</w:t>
             </w:r>
           </w:p>
         </w:tc>
@@ -488,7 +519,7 @@
           </w:tcPr>
           <w:p>
             <w:r>
-              <w:t>트리거</w:t>
+              <w:t>트리거 방식</w:t>
             </w:r>
           </w:p>
         </w:tc>
@@ -552,7 +583,7 @@
           </w:tcPr>
           <w:p>
             <w:r>
-              <w:t>Lock</w:t>
+              <w:t>Lock 제어</w:t>
             </w:r>
           </w:p>
         </w:tc>
@@ -584,7 +615,7 @@
           </w:tcPr>
           <w:p>
             <w:r>
-              <w:t>폼 공급</w:t>
+              <w:t>폼 공급 전략</w:t>
             </w:r>
           </w:p>
         </w:tc>
@@ -604,7 +635,7 @@
           </w:tcPr>
           <w:p>
             <w:r>
-              <w:t>빠른 출시 + 장기 차별화</w:t>
+              <w:t>빠른 출시 + 장기 기술 차별화</w:t>
             </w:r>
           </w:p>
         </w:tc>
@@ -616,7 +647,7 @@
           </w:tcPr>
           <w:p>
             <w:r>
-              <w:t>파트너십</w:t>
+              <w:t>파트너십 전략</w:t>
             </w:r>
           </w:p>
         </w:tc>
@@ -626,7 +657,7 @@
           </w:tcPr>
           <w:p>
             <w:r>
-              <w:t>디스펜서 제조사 공동개발</w:t>
+              <w:t>디스펜서 제조사 공동개발 우선</w:t>
             </w:r>
           </w:p>
         </w:tc>
@@ -636,7 +667,7 @@
           </w:tcPr>
           <w:p>
             <w:r>
-              <w:t>호환성 해결 + 유통망 확보</w:t>
+              <w:t>호환성 해결 + 기존 유통망 활용</w:t>
             </w:r>
           </w:p>
         </w:tc>
@@ -651,41 +682,9 @@
       <w:r>
         <w:rPr>
           <w:color w:val="1F497D"/>
-          <w:sz w:val="36"/>
+          <w:sz w:val="32"/>
         </w:rPr>
-        <w:t>5. B2B 타겟 고객</w:t>
-      </w:r>
-    </w:p>
-    <w:p>
-      <w:pPr>
-        <w:pStyle w:val="ListBullet"/>
-      </w:pPr>
-      <w:r>
-        <w:t>고속도로 휴게소</w:t>
-      </w:r>
-    </w:p>
-    <w:p>
-      <w:pPr>
-        <w:pStyle w:val="ListBullet"/>
-      </w:pPr>
-      <w:r>
-        <w:t>공공기관 (정부·지자체 청사)</w:t>
-      </w:r>
-    </w:p>
-    <w:p>
-      <w:pPr>
-        <w:pStyle w:val="ListBullet"/>
-      </w:pPr>
-      <w:r>
-        <w:t>대형 쇼핑몰·복합시설</w:t>
-      </w:r>
-    </w:p>
-    <w:p>
-      <w:pPr>
-        <w:pStyle w:val="ListBullet"/>
-      </w:pPr>
-      <w:r>
-        <w:t>기업 오피스 빌딩</w:t>
+        <w:t>5. B2B 전략</w:t>
       </w:r>
     </w:p>
     <w:p>
@@ -696,9 +695,156 @@
       <w:r>
         <w:rPr>
           <w:color w:val="2E74B5"/>
-          <w:sz w:val="28"/>
+          <w:sz w:val="26"/>
         </w:rPr>
-        <w:t>B2B 설득 포인트</w:t>
+        <w:t>5-1. 타겟 고객</w:t>
+      </w:r>
+    </w:p>
+    <w:tbl>
+      <w:tblPr>
+        <w:tblStyle w:val="TableGrid"/>
+        <w:tblW w:type="auto" w:w="0"/>
+        <w:tblLook w:firstColumn="1" w:firstRow="1" w:lastColumn="0" w:lastRow="0" w:noHBand="0" w:noVBand="1" w:val="04A0"/>
+      </w:tblPr>
+      <w:tblGrid>
+        <w:gridCol w:w="4320"/>
+        <w:gridCol w:w="4320"/>
+      </w:tblGrid>
+      <w:tr>
+        <w:tc>
+          <w:tcPr>
+            <w:tcW w:type="dxa" w:w="4320"/>
+          </w:tcPr>
+          <w:p>
+            <w:pPr>
+              <w:jc w:val="center"/>
+            </w:pPr>
+            <w:r>
+              <w:rPr>
+                <w:b/>
+              </w:rPr>
+              <w:t>타겟</w:t>
+            </w:r>
+          </w:p>
+        </w:tc>
+        <w:tc>
+          <w:tcPr>
+            <w:tcW w:type="dxa" w:w="4320"/>
+          </w:tcPr>
+          <w:p>
+            <w:pPr>
+              <w:jc w:val="center"/>
+            </w:pPr>
+            <w:r>
+              <w:rPr>
+                <w:b/>
+              </w:rPr>
+              <w:t>이유</w:t>
+            </w:r>
+          </w:p>
+        </w:tc>
+      </w:tr>
+      <w:tr>
+        <w:tc>
+          <w:tcPr>
+            <w:tcW w:type="dxa" w:w="4320"/>
+          </w:tcPr>
+          <w:p>
+            <w:r>
+              <w:t>고속도로 휴게소</w:t>
+            </w:r>
+          </w:p>
+        </w:tc>
+        <w:tc>
+          <w:tcPr>
+            <w:tcW w:type="dxa" w:w="4320"/>
+          </w:tcPr>
+          <w:p>
+            <w:r>
+              <w:t>유동인구 최대, 빠른 사용 데이터 확보 가능</w:t>
+            </w:r>
+          </w:p>
+        </w:tc>
+      </w:tr>
+      <w:tr>
+        <w:tc>
+          <w:tcPr>
+            <w:tcW w:type="dxa" w:w="4320"/>
+          </w:tcPr>
+          <w:p>
+            <w:r>
+              <w:t>공공기관 (정부·지자체 청사)</w:t>
+            </w:r>
+          </w:p>
+        </w:tc>
+        <w:tc>
+          <w:tcPr>
+            <w:tcW w:type="dxa" w:w="4320"/>
+          </w:tcPr>
+          <w:p>
+            <w:r>
+              <w:t>공공 위생 개선 명분, 대규모 계약 가능</w:t>
+            </w:r>
+          </w:p>
+        </w:tc>
+      </w:tr>
+      <w:tr>
+        <w:tc>
+          <w:tcPr>
+            <w:tcW w:type="dxa" w:w="4320"/>
+          </w:tcPr>
+          <w:p>
+            <w:r>
+              <w:t>대형 쇼핑몰·복합시설</w:t>
+            </w:r>
+          </w:p>
+        </w:tc>
+        <w:tc>
+          <w:tcPr>
+            <w:tcW w:type="dxa" w:w="4320"/>
+          </w:tcPr>
+          <w:p>
+            <w:r>
+              <w:t>방문객 만족도 차별화 포인트</w:t>
+            </w:r>
+          </w:p>
+        </w:tc>
+      </w:tr>
+      <w:tr>
+        <w:tc>
+          <w:tcPr>
+            <w:tcW w:type="dxa" w:w="4320"/>
+          </w:tcPr>
+          <w:p>
+            <w:r>
+              <w:t>기업 오피스 빌딩</w:t>
+            </w:r>
+          </w:p>
+        </w:tc>
+        <w:tc>
+          <w:tcPr>
+            <w:tcW w:type="dxa" w:w="4320"/>
+          </w:tcPr>
+          <w:p>
+            <w:r>
+              <w:t>총무팀 의사결정 빠름, 피드백 품질 높음</w:t>
+            </w:r>
+          </w:p>
+        </w:tc>
+      </w:tr>
+    </w:tbl>
+    <w:p/>
+    <w:p>
+      <w:pPr>
+        <w:pStyle w:val="Heading2"/>
+        <w:jc w:val="left"/>
+      </w:pPr>
+      <w:r>
+        <w:rPr>
+          <w:color w:val="2E74B5"/>
+          <w:sz w:val="26"/>
+        </w:rPr>
+        <w:t>5-2. B2B 설득 포인트</w:t>
       </w:r>
     </w:p>
     <w:tbl>
@@ -752,7 +898,7 @@
           </w:tcPr>
           <w:p>
             <w:r>
-              <w:t>"휴지 사용량 늘어나서 비용 증가 아닌가?"</w:t>
+              <w:t>"휴지 사용량 늘어 비용 증가 아닌가?"</w:t>
             </w:r>
           </w:p>
         </w:tc>
@@ -762,7 +908,7 @@
           </w:tcPr>
           <w:p>
             <w:r>
-              <w:t>물티슈 변기 막힘 해결 비용 절감이 더 큼</w:t>
+              <w:t>물티슈 변기 막힘 수리 비용 절감이 훨씬 큼</w:t>
             </w:r>
           </w:p>
         </w:tc>
@@ -784,7 +930,7 @@
           </w:tcPr>
           <w:p>
             <w:r>
-              <w:t>기존 디스펜서 그대로, 모듈만 부착</w:t>
+              <w:t>기존 디스펜서 그대로, 모듈만 부착 (5분 설치)</w:t>
             </w:r>
           </w:p>
         </w:tc>
@@ -806,7 +952,7 @@
           </w:tcPr>
           <w:p>
             <w:r>
-              <w:t>폼 카트리지 정기 구독으로 관리 일원화</w:t>
+              <w:t>카트리지 정기 구독 하나로 관리 일원화</w:t>
             </w:r>
           </w:p>
         </w:tc>
@@ -828,7 +974,29 @@
           </w:tcPr>
           <w:p>
             <w:r>
-              <w:t>순수 기계식, 전원 불필요</w:t>
+              <w:t>순수 기계식, 전원 일절 불필요</w:t>
+            </w:r>
+          </w:p>
+        </w:tc>
+      </w:tr>
+      <w:tr>
+        <w:tc>
+          <w:tcPr>
+            <w:tcW w:type="dxa" w:w="4320"/>
+          </w:tcPr>
+          <w:p>
+            <w:r>
+              <w:t>"사용자가 거부감 느끼지 않나?"</w:t>
+            </w:r>
+          </w:p>
+        </w:tc>
+        <w:tc>
+          <w:tcPr>
+            <w:tcW w:type="dxa" w:w="4320"/>
+          </w:tcPr>
+          <w:p>
+            <w:r>
+              <w:t>Lock 스위치로 개인 선택권 보장</w:t>
             </w:r>
           </w:p>
         </w:tc>
@@ -843,54 +1011,9 @@
       <w:r>
         <w:rPr>
           <w:color w:val="1F497D"/>
-          <w:sz w:val="36"/>
+          <w:sz w:val="32"/>
         </w:rPr>
-        <w:t>6. 비즈니스 모델 &amp; 수익 구조</w:t>
-      </w:r>
-    </w:p>
-    <w:p>
-      <w:r>
-        <w:rPr>
-          <w:b/>
-        </w:rPr>
-        <w:t>Phase 1 (0~12개월): 디스펜서 제조사 파트너십</w:t>
-      </w:r>
-    </w:p>
-    <w:p>
-      <w:r>
-        <w:t>공동개발 → 제조사 기존 유통망으로 시장 진입</w:t>
-        <w:br/>
-        <w:t>수익: 모듈 공급가 + 카트리지 초도물량</w:t>
-      </w:r>
-    </w:p>
-    <w:p>
-      <w:r>
-        <w:rPr>
-          <w:b/>
-        </w:rPr>
-        <w:t>Phase 2 (12~24개월): 카트리지 구독 정착</w:t>
-      </w:r>
-    </w:p>
-    <w:p>
-      <w:r>
-        <w:t>B2B 구독 (월정액 or 카트리지 소진 시 자동 배송)</w:t>
-        <w:br/>
-        <w:t>데이터 확보 → 교체 주기·사용량 최적화</w:t>
-      </w:r>
-    </w:p>
-    <w:p>
-      <w:r>
-        <w:rPr>
-          <w:b/>
-        </w:rPr>
-        <w:t>Phase 3 (24개월+): 자체 폼 포뮬러 + 자체 브랜드</w:t>
-      </w:r>
-    </w:p>
-    <w:p>
-      <w:r>
-        <w:t>특허 출원 → 경쟁사 진입 장벽</w:t>
-        <w:br/>
-        <w:t>독립 브랜드로 직접 B2B 영업 확장</w:t>
+        <w:t>6. 비즈니스 모델 &amp; 로드맵</w:t>
       </w:r>
     </w:p>
     <w:p>
@@ -901,9 +1024,9 @@
       <w:r>
         <w:rPr>
           <w:color w:val="2E74B5"/>
-          <w:sz w:val="28"/>
+          <w:sz w:val="26"/>
         </w:rPr>
-        <w:t>수익 구조 요약</w:t>
+        <w:t>수익 구조</w:t>
       </w:r>
     </w:p>
     <w:tbl>
@@ -913,29 +1036,14 @@
         <w:tblLook w:firstColumn="1" w:firstRow="1" w:lastColumn="0" w:lastRow="0" w:noHBand="0" w:noVBand="1" w:val="04A0"/>
       </w:tblPr>
       <w:tblGrid>
-        <w:gridCol w:w="4320"/>
-        <w:gridCol w:w="4320"/>
+        <w:gridCol w:w="2880"/>
+        <w:gridCol w:w="2880"/>
+        <w:gridCol w:w="2880"/>
       </w:tblGrid>
       <w:tr>
         <w:tc>
           <w:tcPr>
-            <w:tcW w:type="dxa" w:w="4320"/>
-          </w:tcPr>
-          <w:p>
-            <w:pPr>
-              <w:jc w:val="center"/>
-            </w:pPr>
-            <w:r>
-              <w:rPr>
-                <w:b/>
-              </w:rPr>
-              <w:t>항목</w:t>
-            </w:r>
-          </w:p>
-        </w:tc>
-        <w:tc>
-          <w:tcPr>
-            <w:tcW w:type="dxa" w:w="4320"/>
+            <w:tcW w:type="dxa" w:w="2880"/>
           </w:tcPr>
           <w:p>
             <w:pPr>
@@ -949,25 +1057,35 @@
             </w:r>
           </w:p>
         </w:tc>
-      </w:tr>
-      <w:tr>
         <w:tc>
           <w:tcPr>
-            <w:tcW w:type="dxa" w:w="4320"/>
+            <w:tcW w:type="dxa" w:w="2880"/>
           </w:tcPr>
           <w:p>
+            <w:pPr>
+              <w:jc w:val="center"/>
+            </w:pPr>
             <w:r>
-              <w:t>모듈</w:t>
+              <w:rPr>
+                <w:b/>
+              </w:rPr>
+              <w:t>방식</w:t>
             </w:r>
           </w:p>
         </w:tc>
         <w:tc>
           <w:tcPr>
-            <w:tcW w:type="dxa" w:w="4320"/>
+            <w:tcW w:type="dxa" w:w="2880"/>
           </w:tcPr>
           <w:p>
+            <w:pPr>
+              <w:jc w:val="center"/>
+            </w:pPr>
             <w:r>
-              <w:t>초기 판매 (원가 근접, 진입 유도)</w:t>
+              <w:rPr>
+                <w:b/>
+              </w:rPr>
+              <w:t>비고</w:t>
             </w:r>
           </w:p>
         </w:tc>
@@ -975,21 +1093,31 @@
       <w:tr>
         <w:tc>
           <w:tcPr>
-            <w:tcW w:type="dxa" w:w="4320"/>
+            <w:tcW w:type="dxa" w:w="2880"/>
           </w:tcPr>
           <w:p>
             <w:r>
-              <w:t>폼 카트리지</w:t>
+              <w:t>모듈 판매</w:t>
             </w:r>
           </w:p>
         </w:tc>
         <w:tc>
           <w:tcPr>
-            <w:tcW w:type="dxa" w:w="4320"/>
+            <w:tcW w:type="dxa" w:w="2880"/>
           </w:tcPr>
           <w:p>
             <w:r>
-              <w:t>정기 구독 (핵심 수익)</w:t>
+              <w:t>초기 하드웨어 판매</w:t>
+            </w:r>
+          </w:p>
+        </w:tc>
+        <w:tc>
+          <w:tcPr>
+            <w:tcW w:type="dxa" w:w="2880"/>
+          </w:tcPr>
+          <w:p>
+            <w:r>
+              <w:t>원가 근접 가격으로 진입 유도</w:t>
             </w:r>
           </w:p>
         </w:tc>
@@ -997,17 +1125,49 @@
       <w:tr>
         <w:tc>
           <w:tcPr>
-            <w:tcW w:type="dxa" w:w="4320"/>
+            <w:tcW w:type="dxa" w:w="2880"/>
           </w:tcPr>
           <w:p>
             <w:r>
-              <w:t>파트너십</w:t>
+              <w:t>폼 카트리지 구독</w:t>
             </w:r>
           </w:p>
         </w:tc>
         <w:tc>
           <w:tcPr>
-            <w:tcW w:type="dxa" w:w="4320"/>
+            <w:tcW w:type="dxa" w:w="2880"/>
+          </w:tcPr>
+          <w:p>
+            <w:r>
+              <w:t>월정액 or 사용량 기반</w:t>
+            </w:r>
+          </w:p>
+        </w:tc>
+        <w:tc>
+          <w:tcPr>
+            <w:tcW w:type="dxa" w:w="2880"/>
+          </w:tcPr>
+          <w:p>
+            <w:r>
+              <w:t>핵심 수익</w:t>
+            </w:r>
+          </w:p>
+        </w:tc>
+      </w:tr>
+      <w:tr>
+        <w:tc>
+          <w:tcPr>
+            <w:tcW w:type="dxa" w:w="2880"/>
+          </w:tcPr>
+          <w:p>
+            <w:r>
+              <w:t>파트너십 수익</w:t>
+            </w:r>
+          </w:p>
+        </w:tc>
+        <w:tc>
+          <w:tcPr>
+            <w:tcW w:type="dxa" w:w="2880"/>
           </w:tcPr>
           <w:p>
             <w:r>
@@ -1015,8 +1175,138 @@
             </w:r>
           </w:p>
         </w:tc>
+        <w:tc>
+          <w:tcPr>
+            <w:tcW w:type="dxa" w:w="2880"/>
+          </w:tcPr>
+          <w:p>
+            <w:r>
+              <w:t>Phase 1 주요 수익</w:t>
+            </w:r>
+          </w:p>
+        </w:tc>
       </w:tr>
     </w:tbl>
+    <w:p/>
+    <w:p>
+      <w:pPr>
+        <w:pStyle w:val="Heading2"/>
+        <w:jc w:val="left"/>
+      </w:pPr>
+      <w:r>
+        <w:rPr>
+          <w:color w:val="2E74B5"/>
+          <w:sz w:val="26"/>
+        </w:rPr>
+        <w:t>3단계 로드맵</w:t>
+      </w:r>
+    </w:p>
+    <w:p>
+      <w:r>
+        <w:rPr>
+          <w:b/>
+        </w:rPr>
+        <w:t>Phase 1 (0~12개월): 파트너십 공동개발</w:t>
+      </w:r>
+    </w:p>
+    <w:p>
+      <w:pPr>
+        <w:pStyle w:val="ListBullet"/>
+      </w:pPr>
+      <w:r>
+        <w:t>디스펜서 제조사 파트너십 체결</w:t>
+      </w:r>
+    </w:p>
+    <w:p>
+      <w:pPr>
+        <w:pStyle w:val="ListBullet"/>
+      </w:pPr>
+      <w:r>
+        <w:t>OEM 폼 세정제 공급 계약</w:t>
+      </w:r>
+    </w:p>
+    <w:p>
+      <w:pPr>
+        <w:pStyle w:val="ListBullet"/>
+      </w:pPr>
+      <w:r>
+        <w:t>PoC 시범 설치 (고속도로 휴게소 우선)</w:t>
+      </w:r>
+    </w:p>
+    <w:p>
+      <w:pPr>
+        <w:pStyle w:val="ListBullet"/>
+      </w:pPr>
+      <w:r>
+        <w:t>기계식 펌프 프로토타입 완성</w:t>
+      </w:r>
+    </w:p>
+    <w:p/>
+    <w:p>
+      <w:r>
+        <w:rPr>
+          <w:b/>
+        </w:rPr>
+        <w:t>Phase 2 (12~24개월): 카트리지 구독 정착</w:t>
+      </w:r>
+    </w:p>
+    <w:p>
+      <w:pPr>
+        <w:pStyle w:val="ListBullet"/>
+      </w:pPr>
+      <w:r>
+        <w:t>B2B 구독 (월정액 or 자동 배송) 런칭</w:t>
+      </w:r>
+    </w:p>
+    <w:p>
+      <w:pPr>
+        <w:pStyle w:val="ListBullet"/>
+      </w:pPr>
+      <w:r>
+        <w:t>사용량 데이터 수집 및 최적화</w:t>
+      </w:r>
+    </w:p>
+    <w:p>
+      <w:pPr>
+        <w:pStyle w:val="ListBullet"/>
+      </w:pPr>
+      <w:r>
+        <w:t>고객사 레퍼런스 확보</w:t>
+      </w:r>
+    </w:p>
+    <w:p/>
+    <w:p>
+      <w:r>
+        <w:rPr>
+          <w:b/>
+        </w:rPr>
+        <w:t>Phase 3 (24개월+): 자체 브랜드 확장</w:t>
+      </w:r>
+    </w:p>
+    <w:p>
+      <w:pPr>
+        <w:pStyle w:val="ListBullet"/>
+      </w:pPr>
+      <w:r>
+        <w:t>자체 폼 포뮬러 개발 및 특허 출원</w:t>
+      </w:r>
+    </w:p>
+    <w:p>
+      <w:pPr>
+        <w:pStyle w:val="ListBullet"/>
+      </w:pPr>
+      <w:r>
+        <w:t>FoamFit 독립 브랜드 론칭</w:t>
+      </w:r>
+    </w:p>
+    <w:p>
+      <w:pPr>
+        <w:pStyle w:val="ListBullet"/>
+      </w:pPr>
+      <w:r>
+        <w:t>직접 B2B 영업 확장</w:t>
+      </w:r>
+    </w:p>
     <w:p/>
     <w:p>
       <w:pPr>
@@ -1026,39 +1316,65 @@
       <w:r>
         <w:rPr>
           <w:color w:val="1F497D"/>
-          <w:sz w:val="36"/>
+          <w:sz w:val="32"/>
         </w:rPr>
-        <w:t>7. 다음 단계</w:t>
+        <w:t>7. 다음 실행 과제</w:t>
       </w:r>
     </w:p>
     <w:p>
+      <w:pPr>
+        <w:pStyle w:val="ListBullet"/>
+      </w:pPr>
       <w:r>
-        <w:t>☐  디스펜서 제조사 리스트업 및 파트너십 접촉</w:t>
+        <w:t>디스펜서 제조사 리스트업 및 파트너십 접촉</w:t>
       </w:r>
     </w:p>
     <w:p>
+      <w:pPr>
+        <w:pStyle w:val="ListBullet"/>
+      </w:pPr>
       <w:r>
-        <w:t>☐  기계식 펌프 프로토타입 제작</w:t>
+        <w:t>기계식 펌프 프로토타입 제작</w:t>
       </w:r>
     </w:p>
     <w:p>
+      <w:pPr>
+        <w:pStyle w:val="ListBullet"/>
+      </w:pPr>
       <w:r>
-        <w:t>☐  OEM 폼 세정제 공급사 탐색</w:t>
+        <w:t>OEM 폼 세정제 공급사 탐색 (뿌리는 비데 폼 제조사)</w:t>
       </w:r>
     </w:p>
     <w:p>
+      <w:pPr>
+        <w:pStyle w:val="ListBullet"/>
+      </w:pPr>
       <w:r>
-        <w:t>☐  특허 선행 조사 (기계식 펌프 + 디스펜서 연동)</w:t>
+        <w:t>특허 선행 조사 (기계식 펌프 + 디스펜서 연동 방식)</w:t>
       </w:r>
     </w:p>
     <w:p>
+      <w:pPr>
+        <w:pStyle w:val="ListBullet"/>
+      </w:pPr>
       <w:r>
-        <w:t>☐  규제/인증 검토 (식약처 등 세정제 관련)</w:t>
+        <w:t>규제·인증 검토 (식약처 세정제 관련)</w:t>
       </w:r>
     </w:p>
     <w:p>
+      <w:pPr>
+        <w:pStyle w:val="ListBullet"/>
+      </w:pPr>
       <w:r>
-        <w:t>☐  MVP PoC 시범 설치 장소 확보</w:t>
+        <w:t>MVP PoC 시범 설치 장소 확보 (고속도로 휴게소 우선)</w:t>
+      </w:r>
+    </w:p>
+    <w:p>
+      <w:pPr>
+        <w:pStyle w:val="ListBullet"/>
+      </w:pPr>
+      <w:r>
+        <w:t>블라인드 추가 설문 (표본 확대, n=100+)</w:t>
       </w:r>
     </w:p>
     <w:sectPr>

</xml_diff>